<commit_message>
feat: unify email alerting for wiki documentation generation and deployment ping failures
</commit_message>
<xml_diff>
--- a/docs/SafeVixAI_MASTER.docx
+++ b/docs/SafeVixAI_MASTER.docx
@@ -33723,7 +33723,7 @@
           <w:i w:val="0"/>
           <w:sz w:val="22"/>
         </w:rPr>
-        <w:t>🕐 Last auto-updated: 2026-05-12 22:47 IST</w:t>
+        <w:t>🕐 Last auto-updated: 2026-05-12 23:05 IST</w:t>
       </w:r>
     </w:p>
     <w:p>
@@ -33951,7 +33951,7 @@
               <w:rPr>
                 <w:sz w:val="18"/>
               </w:rPr>
-              <w:t>2</w:t>
+              <w:t>1</w:t>
             </w:r>
           </w:p>
         </w:tc>
@@ -34060,7 +34060,7 @@
               <w:rPr>
                 <w:sz w:val="18"/>
               </w:rPr>
-              <w:t>291ms | HTTP 404 | v?</w:t>
+              <w:t>1048ms | HTTP 404 | v?</w:t>
             </w:r>
           </w:p>
         </w:tc>
@@ -34101,7 +34101,7 @@
               <w:rPr>
                 <w:sz w:val="18"/>
               </w:rPr>
-              <w:t>198ms | HTTP 404 | v?</w:t>
+              <w:t>687ms | HTTP 404 | v?</w:t>
             </w:r>
           </w:p>
         </w:tc>
@@ -34142,7 +34142,7 @@
               <w:rPr>
                 <w:sz w:val="18"/>
               </w:rPr>
-              <w:t>283ms | HTTP 200 | v?</w:t>
+              <w:t>762ms | HTTP 200 | v?</w:t>
             </w:r>
           </w:p>
         </w:tc>
@@ -34250,7 +34250,7 @@
               <w:rPr>
                 <w:sz w:val="18"/>
               </w:rPr>
-              <w:t>⏳ Render Deploy Readiness</w:t>
+              <w:t>✅ pages build and deployment</w:t>
             </w:r>
           </w:p>
         </w:tc>
@@ -34263,7 +34263,7 @@
               <w:rPr>
                 <w:sz w:val="18"/>
               </w:rPr>
-              <w:t>main</w:t>
+              <w:t>gh-pages</w:t>
             </w:r>
           </w:p>
         </w:tc>
@@ -34276,7 +34276,7 @@
               <w:rPr>
                 <w:sz w:val="18"/>
               </w:rPr>
-              <w:t>in_progress</w:t>
+              <w:t>success</w:t>
             </w:r>
           </w:p>
         </w:tc>
@@ -34304,7 +34304,7 @@
               <w:rPr>
                 <w:sz w:val="18"/>
               </w:rPr>
-              <w:t>⏳ Security &amp; SAST Audit</w:t>
+              <w:t>✅ Code Quality: PR #11</w:t>
             </w:r>
           </w:p>
         </w:tc>
@@ -34317,7 +34317,7 @@
               <w:rPr>
                 <w:sz w:val="18"/>
               </w:rPr>
-              <w:t>main</w:t>
+              <w:t>refs/pull/11/head</w:t>
             </w:r>
           </w:p>
         </w:tc>
@@ -34330,7 +34330,7 @@
               <w:rPr>
                 <w:sz w:val="18"/>
               </w:rPr>
-              <w:t>in_progress</w:t>
+              <w:t>success</w:t>
             </w:r>
           </w:p>
         </w:tc>
@@ -34358,7 +34358,7 @@
               <w:rPr>
                 <w:sz w:val="18"/>
               </w:rPr>
-              <w:t>⏳ Backend Core CI</w:t>
+              <w:t>✅ PR #11</w:t>
             </w:r>
           </w:p>
         </w:tc>
@@ -34371,7 +34371,7 @@
               <w:rPr>
                 <w:sz w:val="18"/>
               </w:rPr>
-              <w:t>main</w:t>
+              <w:t>refs/pull/11/head</w:t>
             </w:r>
           </w:p>
         </w:tc>
@@ -34384,7 +34384,7 @@
               <w:rPr>
                 <w:sz w:val="18"/>
               </w:rPr>
-              <w:t>in_progress</w:t>
+              <w:t>success</w:t>
             </w:r>
           </w:p>
         </w:tc>
@@ -34412,7 +34412,7 @@
               <w:rPr>
                 <w:sz w:val="18"/>
               </w:rPr>
-              <w:t>⏳ Update Master Document</w:t>
+              <w:t>✅ Deploy Enterprise Docs</w:t>
             </w:r>
           </w:p>
         </w:tc>
@@ -34438,7 +34438,7 @@
               <w:rPr>
                 <w:sz w:val="18"/>
               </w:rPr>
-              <w:t>in_progress</w:t>
+              <w:t>success</w:t>
             </w:r>
           </w:p>
         </w:tc>
@@ -34466,7 +34466,7 @@
               <w:rPr>
                 <w:sz w:val="18"/>
               </w:rPr>
-              <w:t>⏳ Wiki Documentation Sync</w:t>
+              <w:t>✅ Wiki Documentation Sync</w:t>
             </w:r>
           </w:p>
         </w:tc>
@@ -34492,7 +34492,7 @@
               <w:rPr>
                 <w:sz w:val="18"/>
               </w:rPr>
-              <w:t>in_progress</w:t>
+              <w:t>success</w:t>
             </w:r>
           </w:p>
         </w:tc>
@@ -34520,7 +34520,7 @@
               <w:rPr>
                 <w:sz w:val="18"/>
               </w:rPr>
-              <w:t>⏳ Deploy Enterprise Docs</w:t>
+              <w:t>✅ Security &amp; SAST Audit</w:t>
             </w:r>
           </w:p>
         </w:tc>
@@ -34546,7 +34546,7 @@
               <w:rPr>
                 <w:sz w:val="18"/>
               </w:rPr>
-              <w:t>in_progress</w:t>
+              <w:t>success</w:t>
             </w:r>
           </w:p>
         </w:tc>
@@ -34574,7 +34574,7 @@
               <w:rPr>
                 <w:sz w:val="18"/>
               </w:rPr>
-              <w:t>⏳ Code Quality: Push on main</w:t>
+              <w:t>✅ Update Master Document</w:t>
             </w:r>
           </w:p>
         </w:tc>
@@ -34600,7 +34600,7 @@
               <w:rPr>
                 <w:sz w:val="18"/>
               </w:rPr>
-              <w:t>in_progress</w:t>
+              <w:t>success</w:t>
             </w:r>
           </w:p>
         </w:tc>
@@ -34628,7 +34628,7 @@
               <w:rPr>
                 <w:sz w:val="18"/>
               </w:rPr>
-              <w:t>⏳ Push on main</w:t>
+              <w:t>✅ Push on main</w:t>
             </w:r>
           </w:p>
         </w:tc>
@@ -34654,7 +34654,7 @@
               <w:rPr>
                 <w:sz w:val="18"/>
               </w:rPr>
-              <w:t>in_progress</w:t>
+              <w:t>success</w:t>
             </w:r>
           </w:p>
         </w:tc>
@@ -34782,6 +34782,222 @@
                 <w:sz w:val="18"/>
               </w:rPr>
               <w:t>Author</w:t>
+            </w:r>
+          </w:p>
+        </w:tc>
+      </w:tr>
+      <w:tr>
+        <w:tc>
+          <w:tcPr>
+            <w:tcW w:type="dxa" w:w="2160"/>
+          </w:tcPr>
+          <w:p>
+            <w:r>
+              <w:rPr>
+                <w:sz w:val="18"/>
+              </w:rPr>
+              <w:t>a9bfcae</w:t>
+            </w:r>
+          </w:p>
+        </w:tc>
+        <w:tc>
+          <w:tcPr>
+            <w:tcW w:type="dxa" w:w="2160"/>
+          </w:tcPr>
+          <w:p>
+            <w:r>
+              <w:rPr>
+                <w:sz w:val="18"/>
+              </w:rPr>
+              <w:t>2026-05-12</w:t>
+            </w:r>
+          </w:p>
+        </w:tc>
+        <w:tc>
+          <w:tcPr>
+            <w:tcW w:type="dxa" w:w="2160"/>
+          </w:tcPr>
+          <w:p>
+            <w:r>
+              <w:rPr>
+                <w:sz w:val="18"/>
+              </w:rPr>
+              <w:t>Merge pull request #10 from SafeVixAI/docs-wiki-auto-update</w:t>
+            </w:r>
+          </w:p>
+        </w:tc>
+        <w:tc>
+          <w:tcPr>
+            <w:tcW w:type="dxa" w:w="2160"/>
+          </w:tcPr>
+          <w:p>
+            <w:r>
+              <w:rPr>
+                <w:sz w:val="18"/>
+              </w:rPr>
+              <w:t>Bappadala Rohith Kumar Naidu</w:t>
+            </w:r>
+          </w:p>
+        </w:tc>
+      </w:tr>
+      <w:tr>
+        <w:tc>
+          <w:tcPr>
+            <w:tcW w:type="dxa" w:w="2160"/>
+          </w:tcPr>
+          <w:p>
+            <w:r>
+              <w:rPr>
+                <w:sz w:val="18"/>
+              </w:rPr>
+              <w:t>7da1591</w:t>
+            </w:r>
+          </w:p>
+        </w:tc>
+        <w:tc>
+          <w:tcPr>
+            <w:tcW w:type="dxa" w:w="2160"/>
+          </w:tcPr>
+          <w:p>
+            <w:r>
+              <w:rPr>
+                <w:sz w:val="18"/>
+              </w:rPr>
+              <w:t>2026-05-12</w:t>
+            </w:r>
+          </w:p>
+        </w:tc>
+        <w:tc>
+          <w:tcPr>
+            <w:tcW w:type="dxa" w:w="2160"/>
+          </w:tcPr>
+          <w:p>
+            <w:r>
+              <w:rPr>
+                <w:sz w:val="18"/>
+              </w:rPr>
+              <w:t>docs(wiki): auto-sync wiki documentation [automated]</w:t>
+            </w:r>
+          </w:p>
+        </w:tc>
+        <w:tc>
+          <w:tcPr>
+            <w:tcW w:type="dxa" w:w="2160"/>
+          </w:tcPr>
+          <w:p>
+            <w:r>
+              <w:rPr>
+                <w:sz w:val="18"/>
+              </w:rPr>
+              <w:t>rohitkumarnaidu</w:t>
+            </w:r>
+          </w:p>
+        </w:tc>
+      </w:tr>
+      <w:tr>
+        <w:tc>
+          <w:tcPr>
+            <w:tcW w:type="dxa" w:w="2160"/>
+          </w:tcPr>
+          <w:p>
+            <w:r>
+              <w:rPr>
+                <w:sz w:val="18"/>
+              </w:rPr>
+              <w:t>cb8a6a3</w:t>
+            </w:r>
+          </w:p>
+        </w:tc>
+        <w:tc>
+          <w:tcPr>
+            <w:tcW w:type="dxa" w:w="2160"/>
+          </w:tcPr>
+          <w:p>
+            <w:r>
+              <w:rPr>
+                <w:sz w:val="18"/>
+              </w:rPr>
+              <w:t>2026-05-12</w:t>
+            </w:r>
+          </w:p>
+        </w:tc>
+        <w:tc>
+          <w:tcPr>
+            <w:tcW w:type="dxa" w:w="2160"/>
+          </w:tcPr>
+          <w:p>
+            <w:r>
+              <w:rPr>
+                <w:sz w:val="18"/>
+              </w:rPr>
+              <w:t>Merge pull request #9 from SafeVixAI/docs-auto-update</w:t>
+            </w:r>
+          </w:p>
+        </w:tc>
+        <w:tc>
+          <w:tcPr>
+            <w:tcW w:type="dxa" w:w="2160"/>
+          </w:tcPr>
+          <w:p>
+            <w:r>
+              <w:rPr>
+                <w:sz w:val="18"/>
+              </w:rPr>
+              <w:t>Bappadala Rohith Kumar Naidu</w:t>
+            </w:r>
+          </w:p>
+        </w:tc>
+      </w:tr>
+      <w:tr>
+        <w:tc>
+          <w:tcPr>
+            <w:tcW w:type="dxa" w:w="2160"/>
+          </w:tcPr>
+          <w:p>
+            <w:r>
+              <w:rPr>
+                <w:sz w:val="18"/>
+              </w:rPr>
+              <w:t>d2474fb</w:t>
+            </w:r>
+          </w:p>
+        </w:tc>
+        <w:tc>
+          <w:tcPr>
+            <w:tcW w:type="dxa" w:w="2160"/>
+          </w:tcPr>
+          <w:p>
+            <w:r>
+              <w:rPr>
+                <w:sz w:val="18"/>
+              </w:rPr>
+              <w:t>2026-05-12</w:t>
+            </w:r>
+          </w:p>
+        </w:tc>
+        <w:tc>
+          <w:tcPr>
+            <w:tcW w:type="dxa" w:w="2160"/>
+          </w:tcPr>
+          <w:p>
+            <w:r>
+              <w:rPr>
+                <w:sz w:val="18"/>
+              </w:rPr>
+              <w:t>docs: auto-update master doc</w:t>
+            </w:r>
+          </w:p>
+        </w:tc>
+        <w:tc>
+          <w:tcPr>
+            <w:tcW w:type="dxa" w:w="2160"/>
+          </w:tcPr>
+          <w:p>
+            <w:r>
+              <w:rPr>
+                <w:sz w:val="18"/>
+              </w:rPr>
+              <w:t>rohitkumarnaidu</w:t>
             </w:r>
           </w:p>
         </w:tc>
@@ -35093,222 +35309,6 @@
                 <w:sz w:val="18"/>
               </w:rPr>
               <w:t>Merge pull request #7 from SafeVixAI/docs-auto-update</w:t>
-            </w:r>
-          </w:p>
-        </w:tc>
-        <w:tc>
-          <w:tcPr>
-            <w:tcW w:type="dxa" w:w="2160"/>
-          </w:tcPr>
-          <w:p>
-            <w:r>
-              <w:rPr>
-                <w:sz w:val="18"/>
-              </w:rPr>
-              <w:t>Bappadala Rohith Kumar Naidu</w:t>
-            </w:r>
-          </w:p>
-        </w:tc>
-      </w:tr>
-      <w:tr>
-        <w:tc>
-          <w:tcPr>
-            <w:tcW w:type="dxa" w:w="2160"/>
-          </w:tcPr>
-          <w:p>
-            <w:r>
-              <w:rPr>
-                <w:sz w:val="18"/>
-              </w:rPr>
-              <w:t>9a2813b</w:t>
-            </w:r>
-          </w:p>
-        </w:tc>
-        <w:tc>
-          <w:tcPr>
-            <w:tcW w:type="dxa" w:w="2160"/>
-          </w:tcPr>
-          <w:p>
-            <w:r>
-              <w:rPr>
-                <w:sz w:val="18"/>
-              </w:rPr>
-              <w:t>2026-05-11</w:t>
-            </w:r>
-          </w:p>
-        </w:tc>
-        <w:tc>
-          <w:tcPr>
-            <w:tcW w:type="dxa" w:w="2160"/>
-          </w:tcPr>
-          <w:p>
-            <w:r>
-              <w:rPr>
-                <w:sz w:val="18"/>
-              </w:rPr>
-              <w:t>docs: auto-update master doc</w:t>
-            </w:r>
-          </w:p>
-        </w:tc>
-        <w:tc>
-          <w:tcPr>
-            <w:tcW w:type="dxa" w:w="2160"/>
-          </w:tcPr>
-          <w:p>
-            <w:r>
-              <w:rPr>
-                <w:sz w:val="18"/>
-              </w:rPr>
-              <w:t>rohitkumarnaidu</w:t>
-            </w:r>
-          </w:p>
-        </w:tc>
-      </w:tr>
-      <w:tr>
-        <w:tc>
-          <w:tcPr>
-            <w:tcW w:type="dxa" w:w="2160"/>
-          </w:tcPr>
-          <w:p>
-            <w:r>
-              <w:rPr>
-                <w:sz w:val="18"/>
-              </w:rPr>
-              <w:t>3621b34</w:t>
-            </w:r>
-          </w:p>
-        </w:tc>
-        <w:tc>
-          <w:tcPr>
-            <w:tcW w:type="dxa" w:w="2160"/>
-          </w:tcPr>
-          <w:p>
-            <w:r>
-              <w:rPr>
-                <w:sz w:val="18"/>
-              </w:rPr>
-              <w:t>2026-05-11</w:t>
-            </w:r>
-          </w:p>
-        </w:tc>
-        <w:tc>
-          <w:tcPr>
-            <w:tcW w:type="dxa" w:w="2160"/>
-          </w:tcPr>
-          <w:p>
-            <w:r>
-              <w:rPr>
-                <w:sz w:val="18"/>
-              </w:rPr>
-              <w:t>docs: remove emojis for professional hackathon format</w:t>
-            </w:r>
-          </w:p>
-        </w:tc>
-        <w:tc>
-          <w:tcPr>
-            <w:tcW w:type="dxa" w:w="2160"/>
-          </w:tcPr>
-          <w:p>
-            <w:r>
-              <w:rPr>
-                <w:sz w:val="18"/>
-              </w:rPr>
-              <w:t>Bappadala Rohith Kumar Naidu</w:t>
-            </w:r>
-          </w:p>
-        </w:tc>
-      </w:tr>
-      <w:tr>
-        <w:tc>
-          <w:tcPr>
-            <w:tcW w:type="dxa" w:w="2160"/>
-          </w:tcPr>
-          <w:p>
-            <w:r>
-              <w:rPr>
-                <w:sz w:val="18"/>
-              </w:rPr>
-              <w:t>bee3ec2</w:t>
-            </w:r>
-          </w:p>
-        </w:tc>
-        <w:tc>
-          <w:tcPr>
-            <w:tcW w:type="dxa" w:w="2160"/>
-          </w:tcPr>
-          <w:p>
-            <w:r>
-              <w:rPr>
-                <w:sz w:val="18"/>
-              </w:rPr>
-              <w:t>2026-05-11</w:t>
-            </w:r>
-          </w:p>
-        </w:tc>
-        <w:tc>
-          <w:tcPr>
-            <w:tcW w:type="dxa" w:w="2160"/>
-          </w:tcPr>
-          <w:p>
-            <w:r>
-              <w:rPr>
-                <w:sz w:val="18"/>
-              </w:rPr>
-              <w:t>ci: fix add-paths syntax in sync-wiki workflow</w:t>
-            </w:r>
-          </w:p>
-        </w:tc>
-        <w:tc>
-          <w:tcPr>
-            <w:tcW w:type="dxa" w:w="2160"/>
-          </w:tcPr>
-          <w:p>
-            <w:r>
-              <w:rPr>
-                <w:sz w:val="18"/>
-              </w:rPr>
-              <w:t>Bappadala Rohith Kumar Naidu</w:t>
-            </w:r>
-          </w:p>
-        </w:tc>
-      </w:tr>
-      <w:tr>
-        <w:tc>
-          <w:tcPr>
-            <w:tcW w:type="dxa" w:w="2160"/>
-          </w:tcPr>
-          <w:p>
-            <w:r>
-              <w:rPr>
-                <w:sz w:val="18"/>
-              </w:rPr>
-              <w:t>901fce7</w:t>
-            </w:r>
-          </w:p>
-        </w:tc>
-        <w:tc>
-          <w:tcPr>
-            <w:tcW w:type="dxa" w:w="2160"/>
-          </w:tcPr>
-          <w:p>
-            <w:r>
-              <w:rPr>
-                <w:sz w:val="18"/>
-              </w:rPr>
-              <w:t>2026-05-11</w:t>
-            </w:r>
-          </w:p>
-        </w:tc>
-        <w:tc>
-          <w:tcPr>
-            <w:tcW w:type="dxa" w:w="2160"/>
-          </w:tcPr>
-          <w:p>
-            <w:r>
-              <w:rPr>
-                <w:sz w:val="18"/>
-              </w:rPr>
-              <w:t>feat(docs): add missing frontend component wiki docs and update chatbot router</w:t>
             </w:r>
           </w:p>
         </w:tc>
@@ -36173,7 +36173,7 @@
               <w:rPr>
                 <w:sz w:val="18"/>
               </w:rPr>
-              <w:t>239</w:t>
+              <w:t>243</w:t>
             </w:r>
           </w:p>
         </w:tc>
@@ -36307,7 +36307,7 @@
         <w:br/>
         <w:t>Generated by scripts/update_master_doc.py</w:t>
         <w:br/>
-        <w:t>Timestamp: 2026-05-12 22:47 IST</w:t>
+        <w:t>Timestamp: 2026-05-12 23:05 IST</w:t>
         <w:br/>
         <w:t>Repository: github.com/SafeVixAI/SafeVixAI</w:t>
       </w:r>

</xml_diff>

<commit_message>
chore: full CI workflow fixes + coverage boost + E2E mock server
- Add k6 load test scripts (backend, frontend, chatbot API)
- Add tests/test_chaos.py and tests/test_contract.py
- Add tests/e2e_mock_server.py for E2E tests without live backend
- Fix frontend.yml: add mock server before E2E tests
- Fix e2e.yml: add mock server before E2E tests
- Raise backend.yml coverage threshold 70% → 80%
- Fix UserProfileResponse from_attributes bug (would 500 on export)
- Add 340+ coverage boost tests across backend + chatbot
  - backend: auth 100%, admin 97%, field_workflow 96%, public 99%,
    user 99%, officers 100%, roadwatch 92%, citizen 80%, authority 82%
  - chatbot: 98% overall (47 missed lines)
- Fix auth rate limit in tests (APP_ENV=test + core.limiter override)
- All 3748 tests passing, 0 failures
</commit_message>
<xml_diff>
--- a/docs/SafeVixAI_MASTER.docx
+++ b/docs/SafeVixAI_MASTER.docx
@@ -33723,7 +33723,7 @@
           <w:i w:val="0"/>
           <w:sz w:val="22"/>
         </w:rPr>
-        <w:t>🕐 Last auto-updated: 2026-05-22 12:25 IST</w:t>
+        <w:t>🕐 Last auto-updated: 2026-06-08 23:07 IST</w:t>
       </w:r>
     </w:p>
     <w:p>
@@ -33867,7 +33867,7 @@
               <w:rPr>
                 <w:sz w:val="18"/>
               </w:rPr>
-              <w:t>49 MB</w:t>
+              <w:t>69 MB</w:t>
             </w:r>
           </w:p>
         </w:tc>
@@ -33923,7 +33923,7 @@
               <w:rPr>
                 <w:sz w:val="18"/>
               </w:rPr>
-              <w:t>2026-05-22</w:t>
+              <w:t>2026-06-08</w:t>
             </w:r>
           </w:p>
         </w:tc>
@@ -33951,7 +33951,7 @@
               <w:rPr>
                 <w:sz w:val="18"/>
               </w:rPr>
-              <w:t>1</w:t>
+              <w:t>35</w:t>
             </w:r>
           </w:p>
         </w:tc>
@@ -34060,7 +34060,7 @@
               <w:rPr>
                 <w:sz w:val="18"/>
               </w:rPr>
-              <w:t>293ms | HTTP 404 | v?</w:t>
+              <w:t>470ms | HTTP 404 | v?</w:t>
             </w:r>
           </w:p>
         </w:tc>
@@ -34101,7 +34101,7 @@
               <w:rPr>
                 <w:sz w:val="18"/>
               </w:rPr>
-              <w:t>214ms | HTTP 404 | v?</w:t>
+              <w:t>484ms | HTTP 404 | v?</w:t>
             </w:r>
           </w:p>
         </w:tc>
@@ -34142,7 +34142,7 @@
               <w:rPr>
                 <w:sz w:val="18"/>
               </w:rPr>
-              <w:t>100ms | HTTP 200 | v?</w:t>
+              <w:t>441ms | HTTP 200 | v?</w:t>
             </w:r>
           </w:p>
         </w:tc>
@@ -34250,7 +34250,385 @@
               <w:rPr>
                 <w:sz w:val="18"/>
               </w:rPr>
-              <w:t>⏳ Update Master Document</w:t>
+              <w:t>⏳ Branch Protection Checks</w:t>
+            </w:r>
+          </w:p>
+        </w:tc>
+        <w:tc>
+          <w:tcPr>
+            <w:tcW w:type="dxa" w:w="2160"/>
+          </w:tcPr>
+          <w:p>
+            <w:r>
+              <w:rPr>
+                <w:sz w:val="18"/>
+              </w:rPr>
+              <w:t>copilot/replace-hardcoded-color-value</w:t>
+            </w:r>
+          </w:p>
+        </w:tc>
+        <w:tc>
+          <w:tcPr>
+            <w:tcW w:type="dxa" w:w="2160"/>
+          </w:tcPr>
+          <w:p>
+            <w:r>
+              <w:rPr>
+                <w:sz w:val="18"/>
+              </w:rPr>
+              <w:t>action_required</w:t>
+            </w:r>
+          </w:p>
+        </w:tc>
+        <w:tc>
+          <w:tcPr>
+            <w:tcW w:type="dxa" w:w="2160"/>
+          </w:tcPr>
+          <w:p>
+            <w:r>
+              <w:rPr>
+                <w:sz w:val="18"/>
+              </w:rPr>
+              <w:t>2026-06-08</w:t>
+            </w:r>
+          </w:p>
+        </w:tc>
+      </w:tr>
+      <w:tr>
+        <w:tc>
+          <w:tcPr>
+            <w:tcW w:type="dxa" w:w="2160"/>
+          </w:tcPr>
+          <w:p>
+            <w:r>
+              <w:rPr>
+                <w:sz w:val="18"/>
+              </w:rPr>
+              <w:t>⏳ Codacy Security Scan</w:t>
+            </w:r>
+          </w:p>
+        </w:tc>
+        <w:tc>
+          <w:tcPr>
+            <w:tcW w:type="dxa" w:w="2160"/>
+          </w:tcPr>
+          <w:p>
+            <w:r>
+              <w:rPr>
+                <w:sz w:val="18"/>
+              </w:rPr>
+              <w:t>copilot/replace-hardcoded-color-value</w:t>
+            </w:r>
+          </w:p>
+        </w:tc>
+        <w:tc>
+          <w:tcPr>
+            <w:tcW w:type="dxa" w:w="2160"/>
+          </w:tcPr>
+          <w:p>
+            <w:r>
+              <w:rPr>
+                <w:sz w:val="18"/>
+              </w:rPr>
+              <w:t>action_required</w:t>
+            </w:r>
+          </w:p>
+        </w:tc>
+        <w:tc>
+          <w:tcPr>
+            <w:tcW w:type="dxa" w:w="2160"/>
+          </w:tcPr>
+          <w:p>
+            <w:r>
+              <w:rPr>
+                <w:sz w:val="18"/>
+              </w:rPr>
+              <w:t>2026-06-08</w:t>
+            </w:r>
+          </w:p>
+        </w:tc>
+      </w:tr>
+      <w:tr>
+        <w:tc>
+          <w:tcPr>
+            <w:tcW w:type="dxa" w:w="2160"/>
+          </w:tcPr>
+          <w:p>
+            <w:r>
+              <w:rPr>
+                <w:sz w:val="18"/>
+              </w:rPr>
+              <w:t>⏳ Render Deploy Readiness</w:t>
+            </w:r>
+          </w:p>
+        </w:tc>
+        <w:tc>
+          <w:tcPr>
+            <w:tcW w:type="dxa" w:w="2160"/>
+          </w:tcPr>
+          <w:p>
+            <w:r>
+              <w:rPr>
+                <w:sz w:val="18"/>
+              </w:rPr>
+              <w:t>copilot/replace-hardcoded-color-value</w:t>
+            </w:r>
+          </w:p>
+        </w:tc>
+        <w:tc>
+          <w:tcPr>
+            <w:tcW w:type="dxa" w:w="2160"/>
+          </w:tcPr>
+          <w:p>
+            <w:r>
+              <w:rPr>
+                <w:sz w:val="18"/>
+              </w:rPr>
+              <w:t>action_required</w:t>
+            </w:r>
+          </w:p>
+        </w:tc>
+        <w:tc>
+          <w:tcPr>
+            <w:tcW w:type="dxa" w:w="2160"/>
+          </w:tcPr>
+          <w:p>
+            <w:r>
+              <w:rPr>
+                <w:sz w:val="18"/>
+              </w:rPr>
+              <w:t>2026-06-08</w:t>
+            </w:r>
+          </w:p>
+        </w:tc>
+      </w:tr>
+      <w:tr>
+        <w:tc>
+          <w:tcPr>
+            <w:tcW w:type="dxa" w:w="2160"/>
+          </w:tcPr>
+          <w:p>
+            <w:r>
+              <w:rPr>
+                <w:sz w:val="18"/>
+              </w:rPr>
+              <w:t>⏳ Security Scan</w:t>
+            </w:r>
+          </w:p>
+        </w:tc>
+        <w:tc>
+          <w:tcPr>
+            <w:tcW w:type="dxa" w:w="2160"/>
+          </w:tcPr>
+          <w:p>
+            <w:r>
+              <w:rPr>
+                <w:sz w:val="18"/>
+              </w:rPr>
+              <w:t>copilot/replace-hardcoded-color-value</w:t>
+            </w:r>
+          </w:p>
+        </w:tc>
+        <w:tc>
+          <w:tcPr>
+            <w:tcW w:type="dxa" w:w="2160"/>
+          </w:tcPr>
+          <w:p>
+            <w:r>
+              <w:rPr>
+                <w:sz w:val="18"/>
+              </w:rPr>
+              <w:t>action_required</w:t>
+            </w:r>
+          </w:p>
+        </w:tc>
+        <w:tc>
+          <w:tcPr>
+            <w:tcW w:type="dxa" w:w="2160"/>
+          </w:tcPr>
+          <w:p>
+            <w:r>
+              <w:rPr>
+                <w:sz w:val="18"/>
+              </w:rPr>
+              <w:t>2026-06-08</w:t>
+            </w:r>
+          </w:p>
+        </w:tc>
+      </w:tr>
+      <w:tr>
+        <w:tc>
+          <w:tcPr>
+            <w:tcW w:type="dxa" w:w="2160"/>
+          </w:tcPr>
+          <w:p>
+            <w:r>
+              <w:rPr>
+                <w:sz w:val="18"/>
+              </w:rPr>
+              <w:t>⏳ Running Copilot cloud agent</w:t>
+            </w:r>
+          </w:p>
+        </w:tc>
+        <w:tc>
+          <w:tcPr>
+            <w:tcW w:type="dxa" w:w="2160"/>
+          </w:tcPr>
+          <w:p>
+            <w:r>
+              <w:rPr>
+                <w:sz w:val="18"/>
+              </w:rPr>
+              <w:t>copilot/replace-hardcoded-color-value</w:t>
+            </w:r>
+          </w:p>
+        </w:tc>
+        <w:tc>
+          <w:tcPr>
+            <w:tcW w:type="dxa" w:w="2160"/>
+          </w:tcPr>
+          <w:p>
+            <w:r>
+              <w:rPr>
+                <w:sz w:val="18"/>
+              </w:rPr>
+              <w:t>in_progress</w:t>
+            </w:r>
+          </w:p>
+        </w:tc>
+        <w:tc>
+          <w:tcPr>
+            <w:tcW w:type="dxa" w:w="2160"/>
+          </w:tcPr>
+          <w:p>
+            <w:r>
+              <w:rPr>
+                <w:sz w:val="18"/>
+              </w:rPr>
+              <w:t>2026-06-08</w:t>
+            </w:r>
+          </w:p>
+        </w:tc>
+      </w:tr>
+      <w:tr>
+        <w:tc>
+          <w:tcPr>
+            <w:tcW w:type="dxa" w:w="2160"/>
+          </w:tcPr>
+          <w:p>
+            <w:r>
+              <w:rPr>
+                <w:sz w:val="18"/>
+              </w:rPr>
+              <w:t>✅ Code Quality: PR #167</w:t>
+            </w:r>
+          </w:p>
+        </w:tc>
+        <w:tc>
+          <w:tcPr>
+            <w:tcW w:type="dxa" w:w="2160"/>
+          </w:tcPr>
+          <w:p>
+            <w:r>
+              <w:rPr>
+                <w:sz w:val="18"/>
+              </w:rPr>
+              <w:t>refs/pull/167/head</w:t>
+            </w:r>
+          </w:p>
+        </w:tc>
+        <w:tc>
+          <w:tcPr>
+            <w:tcW w:type="dxa" w:w="2160"/>
+          </w:tcPr>
+          <w:p>
+            <w:r>
+              <w:rPr>
+                <w:sz w:val="18"/>
+              </w:rPr>
+              <w:t>success</w:t>
+            </w:r>
+          </w:p>
+        </w:tc>
+        <w:tc>
+          <w:tcPr>
+            <w:tcW w:type="dxa" w:w="2160"/>
+          </w:tcPr>
+          <w:p>
+            <w:r>
+              <w:rPr>
+                <w:sz w:val="18"/>
+              </w:rPr>
+              <w:t>2026-06-08</w:t>
+            </w:r>
+          </w:p>
+        </w:tc>
+      </w:tr>
+      <w:tr>
+        <w:tc>
+          <w:tcPr>
+            <w:tcW w:type="dxa" w:w="2160"/>
+          </w:tcPr>
+          <w:p>
+            <w:r>
+              <w:rPr>
+                <w:sz w:val="18"/>
+              </w:rPr>
+              <w:t>✅ PR #167</w:t>
+            </w:r>
+          </w:p>
+        </w:tc>
+        <w:tc>
+          <w:tcPr>
+            <w:tcW w:type="dxa" w:w="2160"/>
+          </w:tcPr>
+          <w:p>
+            <w:r>
+              <w:rPr>
+                <w:sz w:val="18"/>
+              </w:rPr>
+              <w:t>refs/pull/167/head</w:t>
+            </w:r>
+          </w:p>
+        </w:tc>
+        <w:tc>
+          <w:tcPr>
+            <w:tcW w:type="dxa" w:w="2160"/>
+          </w:tcPr>
+          <w:p>
+            <w:r>
+              <w:rPr>
+                <w:sz w:val="18"/>
+              </w:rPr>
+              <w:t>success</w:t>
+            </w:r>
+          </w:p>
+        </w:tc>
+        <w:tc>
+          <w:tcPr>
+            <w:tcW w:type="dxa" w:w="2160"/>
+          </w:tcPr>
+          <w:p>
+            <w:r>
+              <w:rPr>
+                <w:sz w:val="18"/>
+              </w:rPr>
+              <w:t>2026-06-08</w:t>
+            </w:r>
+          </w:p>
+        </w:tc>
+      </w:tr>
+      <w:tr>
+        <w:tc>
+          <w:tcPr>
+            <w:tcW w:type="dxa" w:w="2160"/>
+          </w:tcPr>
+          <w:p>
+            <w:r>
+              <w:rPr>
+                <w:sz w:val="18"/>
+              </w:rPr>
+              <w:t>⏳ Blue-Green Deployment</w:t>
             </w:r>
           </w:p>
         </w:tc>
@@ -34276,7 +34654,7 @@
               <w:rPr>
                 <w:sz w:val="18"/>
               </w:rPr>
-              <w:t>in_progress</w:t>
+              <w:t>skipped</w:t>
             </w:r>
           </w:p>
         </w:tc>
@@ -34289,385 +34667,7 @@
               <w:rPr>
                 <w:sz w:val="18"/>
               </w:rPr>
-              <w:t>2026-05-22</w:t>
-            </w:r>
-          </w:p>
-        </w:tc>
-      </w:tr>
-      <w:tr>
-        <w:tc>
-          <w:tcPr>
-            <w:tcW w:type="dxa" w:w="2160"/>
-          </w:tcPr>
-          <w:p>
-            <w:r>
-              <w:rPr>
-                <w:sz w:val="18"/>
-              </w:rPr>
-              <w:t>⏳ Wiki Documentation Sync</w:t>
-            </w:r>
-          </w:p>
-        </w:tc>
-        <w:tc>
-          <w:tcPr>
-            <w:tcW w:type="dxa" w:w="2160"/>
-          </w:tcPr>
-          <w:p>
-            <w:r>
-              <w:rPr>
-                <w:sz w:val="18"/>
-              </w:rPr>
-              <w:t>main</w:t>
-            </w:r>
-          </w:p>
-        </w:tc>
-        <w:tc>
-          <w:tcPr>
-            <w:tcW w:type="dxa" w:w="2160"/>
-          </w:tcPr>
-          <w:p>
-            <w:r>
-              <w:rPr>
-                <w:sz w:val="18"/>
-              </w:rPr>
-              <w:t>in_progress</w:t>
-            </w:r>
-          </w:p>
-        </w:tc>
-        <w:tc>
-          <w:tcPr>
-            <w:tcW w:type="dxa" w:w="2160"/>
-          </w:tcPr>
-          <w:p>
-            <w:r>
-              <w:rPr>
-                <w:sz w:val="18"/>
-              </w:rPr>
-              <w:t>2026-05-22</w:t>
-            </w:r>
-          </w:p>
-        </w:tc>
-      </w:tr>
-      <w:tr>
-        <w:tc>
-          <w:tcPr>
-            <w:tcW w:type="dxa" w:w="2160"/>
-          </w:tcPr>
-          <w:p>
-            <w:r>
-              <w:rPr>
-                <w:sz w:val="18"/>
-              </w:rPr>
-              <w:t>⏳ Deploy Enterprise Docs</w:t>
-            </w:r>
-          </w:p>
-        </w:tc>
-        <w:tc>
-          <w:tcPr>
-            <w:tcW w:type="dxa" w:w="2160"/>
-          </w:tcPr>
-          <w:p>
-            <w:r>
-              <w:rPr>
-                <w:sz w:val="18"/>
-              </w:rPr>
-              <w:t>main</w:t>
-            </w:r>
-          </w:p>
-        </w:tc>
-        <w:tc>
-          <w:tcPr>
-            <w:tcW w:type="dxa" w:w="2160"/>
-          </w:tcPr>
-          <w:p>
-            <w:r>
-              <w:rPr>
-                <w:sz w:val="18"/>
-              </w:rPr>
-              <w:t>in_progress</w:t>
-            </w:r>
-          </w:p>
-        </w:tc>
-        <w:tc>
-          <w:tcPr>
-            <w:tcW w:type="dxa" w:w="2160"/>
-          </w:tcPr>
-          <w:p>
-            <w:r>
-              <w:rPr>
-                <w:sz w:val="18"/>
-              </w:rPr>
-              <w:t>2026-05-22</w:t>
-            </w:r>
-          </w:p>
-        </w:tc>
-      </w:tr>
-      <w:tr>
-        <w:tc>
-          <w:tcPr>
-            <w:tcW w:type="dxa" w:w="2160"/>
-          </w:tcPr>
-          <w:p>
-            <w:r>
-              <w:rPr>
-                <w:sz w:val="18"/>
-              </w:rPr>
-              <w:t>🔴 .github/workflows/smoke-tests.yml</w:t>
-            </w:r>
-          </w:p>
-        </w:tc>
-        <w:tc>
-          <w:tcPr>
-            <w:tcW w:type="dxa" w:w="2160"/>
-          </w:tcPr>
-          <w:p>
-            <w:r>
-              <w:rPr>
-                <w:sz w:val="18"/>
-              </w:rPr>
-              <w:t>main</w:t>
-            </w:r>
-          </w:p>
-        </w:tc>
-        <w:tc>
-          <w:tcPr>
-            <w:tcW w:type="dxa" w:w="2160"/>
-          </w:tcPr>
-          <w:p>
-            <w:r>
-              <w:rPr>
-                <w:sz w:val="18"/>
-              </w:rPr>
-              <w:t>failure</w:t>
-            </w:r>
-          </w:p>
-        </w:tc>
-        <w:tc>
-          <w:tcPr>
-            <w:tcW w:type="dxa" w:w="2160"/>
-          </w:tcPr>
-          <w:p>
-            <w:r>
-              <w:rPr>
-                <w:sz w:val="18"/>
-              </w:rPr>
-              <w:t>2026-05-22</w:t>
-            </w:r>
-          </w:p>
-        </w:tc>
-      </w:tr>
-      <w:tr>
-        <w:tc>
-          <w:tcPr>
-            <w:tcW w:type="dxa" w:w="2160"/>
-          </w:tcPr>
-          <w:p>
-            <w:r>
-              <w:rPr>
-                <w:sz w:val="18"/>
-              </w:rPr>
-              <w:t>⏳ Push on main</w:t>
-            </w:r>
-          </w:p>
-        </w:tc>
-        <w:tc>
-          <w:tcPr>
-            <w:tcW w:type="dxa" w:w="2160"/>
-          </w:tcPr>
-          <w:p>
-            <w:r>
-              <w:rPr>
-                <w:sz w:val="18"/>
-              </w:rPr>
-              <w:t>main</w:t>
-            </w:r>
-          </w:p>
-        </w:tc>
-        <w:tc>
-          <w:tcPr>
-            <w:tcW w:type="dxa" w:w="2160"/>
-          </w:tcPr>
-          <w:p>
-            <w:r>
-              <w:rPr>
-                <w:sz w:val="18"/>
-              </w:rPr>
-              <w:t>in_progress</w:t>
-            </w:r>
-          </w:p>
-        </w:tc>
-        <w:tc>
-          <w:tcPr>
-            <w:tcW w:type="dxa" w:w="2160"/>
-          </w:tcPr>
-          <w:p>
-            <w:r>
-              <w:rPr>
-                <w:sz w:val="18"/>
-              </w:rPr>
-              <w:t>2026-05-22</w:t>
-            </w:r>
-          </w:p>
-        </w:tc>
-      </w:tr>
-      <w:tr>
-        <w:tc>
-          <w:tcPr>
-            <w:tcW w:type="dxa" w:w="2160"/>
-          </w:tcPr>
-          <w:p>
-            <w:r>
-              <w:rPr>
-                <w:sz w:val="18"/>
-              </w:rPr>
-              <w:t>⏳ Code Quality: Push on main</w:t>
-            </w:r>
-          </w:p>
-        </w:tc>
-        <w:tc>
-          <w:tcPr>
-            <w:tcW w:type="dxa" w:w="2160"/>
-          </w:tcPr>
-          <w:p>
-            <w:r>
-              <w:rPr>
-                <w:sz w:val="18"/>
-              </w:rPr>
-              <w:t>main</w:t>
-            </w:r>
-          </w:p>
-        </w:tc>
-        <w:tc>
-          <w:tcPr>
-            <w:tcW w:type="dxa" w:w="2160"/>
-          </w:tcPr>
-          <w:p>
-            <w:r>
-              <w:rPr>
-                <w:sz w:val="18"/>
-              </w:rPr>
-              <w:t>in_progress</w:t>
-            </w:r>
-          </w:p>
-        </w:tc>
-        <w:tc>
-          <w:tcPr>
-            <w:tcW w:type="dxa" w:w="2160"/>
-          </w:tcPr>
-          <w:p>
-            <w:r>
-              <w:rPr>
-                <w:sz w:val="18"/>
-              </w:rPr>
-              <w:t>2026-05-22</w:t>
-            </w:r>
-          </w:p>
-        </w:tc>
-      </w:tr>
-      <w:tr>
-        <w:tc>
-          <w:tcPr>
-            <w:tcW w:type="dxa" w:w="2160"/>
-          </w:tcPr>
-          <w:p>
-            <w:r>
-              <w:rPr>
-                <w:sz w:val="18"/>
-              </w:rPr>
-              <w:t>🔴 Frontend CI</w:t>
-            </w:r>
-          </w:p>
-        </w:tc>
-        <w:tc>
-          <w:tcPr>
-            <w:tcW w:type="dxa" w:w="2160"/>
-          </w:tcPr>
-          <w:p>
-            <w:r>
-              <w:rPr>
-                <w:sz w:val="18"/>
-              </w:rPr>
-              <w:t>dependabot/npm_and_yarn/frontend/frontend-dependencies-858b392ac1</w:t>
-            </w:r>
-          </w:p>
-        </w:tc>
-        <w:tc>
-          <w:tcPr>
-            <w:tcW w:type="dxa" w:w="2160"/>
-          </w:tcPr>
-          <w:p>
-            <w:r>
-              <w:rPr>
-                <w:sz w:val="18"/>
-              </w:rPr>
-              <w:t>failure</w:t>
-            </w:r>
-          </w:p>
-        </w:tc>
-        <w:tc>
-          <w:tcPr>
-            <w:tcW w:type="dxa" w:w="2160"/>
-          </w:tcPr>
-          <w:p>
-            <w:r>
-              <w:rPr>
-                <w:sz w:val="18"/>
-              </w:rPr>
-              <w:t>2026-05-22</w:t>
-            </w:r>
-          </w:p>
-        </w:tc>
-      </w:tr>
-      <w:tr>
-        <w:tc>
-          <w:tcPr>
-            <w:tcW w:type="dxa" w:w="2160"/>
-          </w:tcPr>
-          <w:p>
-            <w:r>
-              <w:rPr>
-                <w:sz w:val="18"/>
-              </w:rPr>
-              <w:t>✅ Render Deploy Readiness</w:t>
-            </w:r>
-          </w:p>
-        </w:tc>
-        <w:tc>
-          <w:tcPr>
-            <w:tcW w:type="dxa" w:w="2160"/>
-          </w:tcPr>
-          <w:p>
-            <w:r>
-              <w:rPr>
-                <w:sz w:val="18"/>
-              </w:rPr>
-              <w:t>dependabot/npm_and_yarn/frontend/frontend-dependencies-858b392ac1</w:t>
-            </w:r>
-          </w:p>
-        </w:tc>
-        <w:tc>
-          <w:tcPr>
-            <w:tcW w:type="dxa" w:w="2160"/>
-          </w:tcPr>
-          <w:p>
-            <w:r>
-              <w:rPr>
-                <w:sz w:val="18"/>
-              </w:rPr>
-              <w:t>success</w:t>
-            </w:r>
-          </w:p>
-        </w:tc>
-        <w:tc>
-          <w:tcPr>
-            <w:tcW w:type="dxa" w:w="2160"/>
-          </w:tcPr>
-          <w:p>
-            <w:r>
-              <w:rPr>
-                <w:sz w:val="18"/>
-              </w:rPr>
-              <w:t>2026-05-22</w:t>
+              <w:t>2026-06-08</w:t>
             </w:r>
           </w:p>
         </w:tc>
@@ -34796,7 +34796,7 @@
               <w:rPr>
                 <w:sz w:val="18"/>
               </w:rPr>
-              <w:t>07d9e50</w:t>
+              <w:t>de21aa0</w:t>
             </w:r>
           </w:p>
         </w:tc>
@@ -34809,7 +34809,7 @@
               <w:rPr>
                 <w:sz w:val="18"/>
               </w:rPr>
-              <w:t>2026-05-22</w:t>
+              <w:t>2026-06-08</w:t>
             </w:r>
           </w:p>
         </w:tc>
@@ -34822,7 +34822,7 @@
               <w:rPr>
                 <w:sz w:val="18"/>
               </w:rPr>
-              <w:t>Merge pull request #13 from SafeVixAI/docs-wiki-auto-update</w:t>
+              <w:t>100% test coverage: fix skipped tests + OpenAPI validation + production bug</w:t>
             </w:r>
           </w:p>
         </w:tc>
@@ -34850,7 +34850,7 @@
               <w:rPr>
                 <w:sz w:val="18"/>
               </w:rPr>
-              <w:t>6f61bed</w:t>
+              <w:t>45115a0</w:t>
             </w:r>
           </w:p>
         </w:tc>
@@ -34863,7 +34863,7 @@
               <w:rPr>
                 <w:sz w:val="18"/>
               </w:rPr>
-              <w:t>2026-05-22</w:t>
+              <w:t>2026-06-08</w:t>
             </w:r>
           </w:p>
         </w:tc>
@@ -34876,61 +34876,7 @@
               <w:rPr>
                 <w:sz w:val="18"/>
               </w:rPr>
-              <w:t>docs(wiki): auto-sync wiki documentation [automated]</w:t>
-            </w:r>
-          </w:p>
-        </w:tc>
-        <w:tc>
-          <w:tcPr>
-            <w:tcW w:type="dxa" w:w="2160"/>
-          </w:tcPr>
-          <w:p>
-            <w:r>
-              <w:rPr>
-                <w:sz w:val="18"/>
-              </w:rPr>
-              <w:t>rohitkumarnaidu</w:t>
-            </w:r>
-          </w:p>
-        </w:tc>
-      </w:tr>
-      <w:tr>
-        <w:tc>
-          <w:tcPr>
-            <w:tcW w:type="dxa" w:w="2160"/>
-          </w:tcPr>
-          <w:p>
-            <w:r>
-              <w:rPr>
-                <w:sz w:val="18"/>
-              </w:rPr>
-              <w:t>e47df81</w:t>
-            </w:r>
-          </w:p>
-        </w:tc>
-        <w:tc>
-          <w:tcPr>
-            <w:tcW w:type="dxa" w:w="2160"/>
-          </w:tcPr>
-          <w:p>
-            <w:r>
-              <w:rPr>
-                <w:sz w:val="18"/>
-              </w:rPr>
-              <w:t>2026-05-22</w:t>
-            </w:r>
-          </w:p>
-        </w:tc>
-        <w:tc>
-          <w:tcPr>
-            <w:tcW w:type="dxa" w:w="2160"/>
-          </w:tcPr>
-          <w:p>
-            <w:r>
-              <w:rPr>
-                <w:sz w:val="18"/>
-              </w:rPr>
-              <w:t>feat(phase3): circuit breakers, enhanced health checks, streaming chat proxy</w:t>
+              <w:t>Enterprise: landing page integration + auth E2E tests</w:t>
             </w:r>
           </w:p>
         </w:tc>
@@ -34958,7 +34904,7 @@
               <w:rPr>
                 <w:sz w:val="18"/>
               </w:rPr>
-              <w:t>9ff7863</w:t>
+              <w:t>74c45c8</w:t>
             </w:r>
           </w:p>
         </w:tc>
@@ -34971,7 +34917,7 @@
               <w:rPr>
                 <w:sz w:val="18"/>
               </w:rPr>
-              <w:t>2026-05-22</w:t>
+              <w:t>2026-06-08</w:t>
             </w:r>
           </w:p>
         </w:tc>
@@ -34984,7 +34930,7 @@
               <w:rPr>
                 <w:sz w:val="18"/>
               </w:rPr>
-              <w:t>ci: fix docker build lowercase repo path, Render redeploy secret check, restrict</w:t>
+              <w:t>Zero-warning lint compliance</w:t>
             </w:r>
           </w:p>
         </w:tc>
@@ -35012,7 +34958,7 @@
               <w:rPr>
                 <w:sz w:val="18"/>
               </w:rPr>
-              <w:t>b46ae16</w:t>
+              <w:t>1201708</w:t>
             </w:r>
           </w:p>
         </w:tc>
@@ -35025,7 +34971,7 @@
               <w:rPr>
                 <w:sz w:val="18"/>
               </w:rPr>
-              <w:t>2026-05-21</w:t>
+              <w:t>2026-06-01</w:t>
             </w:r>
           </w:p>
         </w:tc>
@@ -35038,7 +34984,7 @@
               <w:rPr>
                 <w:sz w:val="18"/>
               </w:rPr>
-              <w:t>Merge pull request #35 from SafeVixAI/phase0-enterprise-security</w:t>
+              <w:t>Fix GSAP SSR crash &amp; E2E test flakiness</w:t>
             </w:r>
           </w:p>
         </w:tc>
@@ -35066,7 +35012,7 @@
               <w:rPr>
                 <w:sz w:val="18"/>
               </w:rPr>
-              <w:t>3b0f090</w:t>
+              <w:t>208d0f0</w:t>
             </w:r>
           </w:p>
         </w:tc>
@@ -35079,7 +35025,7 @@
               <w:rPr>
                 <w:sz w:val="18"/>
               </w:rPr>
-              <w:t>2026-05-21</w:t>
+              <w:t>2026-05-31</w:t>
             </w:r>
           </w:p>
         </w:tc>
@@ -35092,7 +35038,7 @@
               <w:rPr>
                 <w:sz w:val="18"/>
               </w:rPr>
-              <w:t>feat(phase3): add response caching + structured logging with correlation IDs</w:t>
+              <w:t>fix: SSR mounted guards, E2E auth route mock, Logo component integration</w:t>
             </w:r>
           </w:p>
         </w:tc>
@@ -35120,7 +35066,7 @@
               <w:rPr>
                 <w:sz w:val="18"/>
               </w:rPr>
-              <w:t>e5f3703</w:t>
+              <w:t>19aac91</w:t>
             </w:r>
           </w:p>
         </w:tc>
@@ -35133,7 +35079,7 @@
               <w:rPr>
                 <w:sz w:val="18"/>
               </w:rPr>
-              <w:t>2026-05-21</w:t>
+              <w:t>2026-05-31</w:t>
             </w:r>
           </w:p>
         </w:tc>
@@ -35146,7 +35092,7 @@
               <w:rPr>
                 <w:sz w:val="18"/>
               </w:rPr>
-              <w:t>docs: add Phase 3 implementation plan</w:t>
+              <w:t>fix: CI — translations tracked, E2E text mismatches, gitignore, responsive thres</w:t>
             </w:r>
           </w:p>
         </w:tc>
@@ -35174,7 +35120,7 @@
               <w:rPr>
                 <w:sz w:val="18"/>
               </w:rPr>
-              <w:t>0d3442e</w:t>
+              <w:t>b9582f7</w:t>
             </w:r>
           </w:p>
         </w:tc>
@@ -35187,7 +35133,7 @@
               <w:rPr>
                 <w:sz w:val="18"/>
               </w:rPr>
-              <w:t>2026-05-21</w:t>
+              <w:t>2026-05-30</w:t>
             </w:r>
           </w:p>
         </w:tc>
@@ -35200,7 +35146,7 @@
               <w:rPr>
                 <w:sz w:val="18"/>
               </w:rPr>
-              <w:t>test: add user, waze, JWKS, Redis tests + fix timezone import (90+ tests)</w:t>
+              <w:t>Merge remote-tracking branch 'origin/dependabot/pip/backend/kaggle-2.2.0'</w:t>
             </w:r>
           </w:p>
         </w:tc>
@@ -35228,7 +35174,7 @@
               <w:rPr>
                 <w:sz w:val="18"/>
               </w:rPr>
-              <w:t>e1ba834</w:t>
+              <w:t>16d6d4e</w:t>
             </w:r>
           </w:p>
         </w:tc>
@@ -35241,7 +35187,7 @@
               <w:rPr>
                 <w:sz w:val="18"/>
               </w:rPr>
-              <w:t>2026-05-21</w:t>
+              <w:t>2026-05-30</w:t>
             </w:r>
           </w:p>
         </w:tc>
@@ -35254,7 +35200,7 @@
               <w:rPr>
                 <w:sz w:val="18"/>
               </w:rPr>
-              <w:t>test: add MCP, live tracking, and emergency API tests (83% coverage)</w:t>
+              <w:t>Merge remote-tracking branch 'origin/dependabot/pip/backend/pytest-cov-7.1.0'</w:t>
             </w:r>
           </w:p>
         </w:tc>
@@ -35282,7 +35228,7 @@
               <w:rPr>
                 <w:sz w:val="18"/>
               </w:rPr>
-              <w:t>8b76b4d</w:t>
+              <w:t>68379f0</w:t>
             </w:r>
           </w:p>
         </w:tc>
@@ -35295,7 +35241,7 @@
               <w:rPr>
                 <w:sz w:val="18"/>
               </w:rPr>
-              <w:t>2026-05-21</w:t>
+              <w:t>2026-05-30</w:t>
             </w:r>
           </w:p>
         </w:tc>
@@ -35308,7 +35254,61 @@
               <w:rPr>
                 <w:sz w:val="18"/>
               </w:rPr>
-              <w:t>fix(tests): remove unused pytz import causing CI failure</w:t>
+              <w:t>Merge remote-tracking branch 'origin/dependabot/pip/chatbot_service/sentry-sdk-2</w:t>
+            </w:r>
+          </w:p>
+        </w:tc>
+        <w:tc>
+          <w:tcPr>
+            <w:tcW w:type="dxa" w:w="2160"/>
+          </w:tcPr>
+          <w:p>
+            <w:r>
+              <w:rPr>
+                <w:sz w:val="18"/>
+              </w:rPr>
+              <w:t>Bappadala Rohith Kumar Naidu</w:t>
+            </w:r>
+          </w:p>
+        </w:tc>
+      </w:tr>
+      <w:tr>
+        <w:tc>
+          <w:tcPr>
+            <w:tcW w:type="dxa" w:w="2160"/>
+          </w:tcPr>
+          <w:p>
+            <w:r>
+              <w:rPr>
+                <w:sz w:val="18"/>
+              </w:rPr>
+              <w:t>d2c981e</w:t>
+            </w:r>
+          </w:p>
+        </w:tc>
+        <w:tc>
+          <w:tcPr>
+            <w:tcW w:type="dxa" w:w="2160"/>
+          </w:tcPr>
+          <w:p>
+            <w:r>
+              <w:rPr>
+                <w:sz w:val="18"/>
+              </w:rPr>
+              <w:t>2026-05-30</w:t>
+            </w:r>
+          </w:p>
+        </w:tc>
+        <w:tc>
+          <w:tcPr>
+            <w:tcW w:type="dxa" w:w="2160"/>
+          </w:tcPr>
+          <w:p>
+            <w:r>
+              <w:rPr>
+                <w:sz w:val="18"/>
+              </w:rPr>
+              <w:t>Merge remote-tracking branch 'origin/dependabot/pip/chatbot_service/pypdf-6.12.2</w:t>
             </w:r>
           </w:p>
         </w:tc>
@@ -36173,7 +36173,7 @@
               <w:rPr>
                 <w:sz w:val="18"/>
               </w:rPr>
-              <w:t>257</w:t>
+              <w:t>345</w:t>
             </w:r>
           </w:p>
         </w:tc>
@@ -36307,7 +36307,7 @@
         <w:br/>
         <w:t>Generated by scripts/update_master_doc.py</w:t>
         <w:br/>
-        <w:t>Timestamp: 2026-05-22 12:25 IST</w:t>
+        <w:t>Timestamp: 2026-06-08 23:07 IST</w:t>
         <w:br/>
         <w:t>Repository: github.com/SafeVixAI/SafeVixAI</w:t>
       </w:r>

</xml_diff>